<commit_message>
Initial commit with project, diagrams, screenshots
</commit_message>
<xml_diff>
--- a/TZ_REPO_module_v1_11052026.docx
+++ b/TZ_REPO_module_v1_11052026.docx
@@ -31811,2150 +31811,6 @@
           <w:lang w:val="en-US"/>
         </w:rPr>
       </w:pPr>
-    </w:p>
-    <w:p>
-      <w:r>
-        <w:br w:type="page"/>
-      </w:r>
-    </w:p>
-    <w:p>
-      <w:pPr>
-        <w:pStyle w:val="Heading1"/>
-      </w:pPr>
-      <w:r>
-        <w:t>15. Архитектурные диаграммы (C4 и UML)</w:t>
-      </w:r>
-    </w:p>
-    <w:p>
-      <w:r>
-        <w:rPr>
-          <w:b w:val="0"/>
-          <w:i w:val="0"/>
-          <w:sz w:val="20"/>
-        </w:rPr>
-        <w:t>Настоящий раздел содержит архитектурные диаграммы Модуля обработки сделок РЕПО, выполненные в нотации C4 Model и UML. Исходные файлы диаграмм в формате Mermaid (.mmd) поставляются вместе с исходным кодом проекта и могут быть отрендерены в любом Mermaid-совместимом инструменте (Mermaid Live Editor, GitLab, GitHub, VS Code).</w:t>
-      </w:r>
-    </w:p>
-    <w:p>
-      <w:pPr>
-        <w:pStyle w:val="Heading2"/>
-      </w:pPr>
-      <w:r>
-        <w:t>15.1 Перечень диаграмм</w:t>
-      </w:r>
-    </w:p>
-    <w:tbl>
-      <w:tblPr>
-        <w:tblW w:type="auto" w:w="0"/>
-        <w:tblLook w:firstColumn="1" w:firstRow="1" w:lastColumn="0" w:lastRow="0" w:noHBand="0" w:noVBand="1" w:val="04A0"/>
-      </w:tblPr>
-      <w:tblGrid>
-        <w:gridCol w:w="2409"/>
-        <w:gridCol w:w="2409"/>
-        <w:gridCol w:w="2409"/>
-        <w:gridCol w:w="2409"/>
-      </w:tblGrid>
-      <w:tr>
-        <w:tc>
-          <w:tcPr>
-            <w:tcW w:type="dxa" w:w="2409"/>
-            <w:shd w:val="clear" w:color="auto" w:fill="1F4E79"/>
-          </w:tcPr>
-          <w:p>
-            <w:r>
-              <w:rPr>
-                <w:b/>
-                <w:color w:val="FFFFFF"/>
-                <w:sz w:val="18"/>
-              </w:rPr>
-              <w:t>Файл</w:t>
-            </w:r>
-          </w:p>
-        </w:tc>
-        <w:tc>
-          <w:tcPr>
-            <w:tcW w:type="dxa" w:w="2409"/>
-            <w:shd w:val="clear" w:color="auto" w:fill="1F4E79"/>
-          </w:tcPr>
-          <w:p>
-            <w:r>
-              <w:rPr>
-                <w:b/>
-                <w:color w:val="FFFFFF"/>
-                <w:sz w:val="18"/>
-              </w:rPr>
-              <w:t>Тип</w:t>
-            </w:r>
-          </w:p>
-        </w:tc>
-        <w:tc>
-          <w:tcPr>
-            <w:tcW w:type="dxa" w:w="2409"/>
-            <w:shd w:val="clear" w:color="auto" w:fill="1F4E79"/>
-          </w:tcPr>
-          <w:p>
-            <w:r>
-              <w:rPr>
-                <w:b/>
-                <w:color w:val="FFFFFF"/>
-                <w:sz w:val="18"/>
-              </w:rPr>
-              <w:t>Нотация</w:t>
-            </w:r>
-          </w:p>
-        </w:tc>
-        <w:tc>
-          <w:tcPr>
-            <w:tcW w:type="dxa" w:w="2409"/>
-            <w:shd w:val="clear" w:color="auto" w:fill="1F4E79"/>
-          </w:tcPr>
-          <w:p>
-            <w:r>
-              <w:rPr>
-                <w:b/>
-                <w:color w:val="FFFFFF"/>
-                <w:sz w:val="18"/>
-              </w:rPr>
-              <w:t>Содержание</w:t>
-            </w:r>
-          </w:p>
-        </w:tc>
-      </w:tr>
-      <w:tr>
-        <w:tc>
-          <w:tcPr>
-            <w:tcW w:type="dxa" w:w="2409"/>
-          </w:tcPr>
-          <w:p>
-            <w:r>
-              <w:rPr>
-                <w:sz w:val="18"/>
-              </w:rPr>
-              <w:t>d1_c4_context.mmd</w:t>
-            </w:r>
-          </w:p>
-        </w:tc>
-        <w:tc>
-          <w:tcPr>
-            <w:tcW w:type="dxa" w:w="2409"/>
-          </w:tcPr>
-          <w:p>
-            <w:r>
-              <w:rPr>
-                <w:sz w:val="18"/>
-              </w:rPr>
-              <w:t>C4 Level 1</w:t>
-            </w:r>
-          </w:p>
-        </w:tc>
-        <w:tc>
-          <w:tcPr>
-            <w:tcW w:type="dxa" w:w="2409"/>
-          </w:tcPr>
-          <w:p>
-            <w:r>
-              <w:rPr>
-                <w:sz w:val="18"/>
-              </w:rPr>
-              <w:t>C4 Context</w:t>
-            </w:r>
-          </w:p>
-        </w:tc>
-        <w:tc>
-          <w:tcPr>
-            <w:tcW w:type="dxa" w:w="2409"/>
-          </w:tcPr>
-          <w:p>
-            <w:r>
-              <w:rPr>
-                <w:sz w:val="18"/>
-              </w:rPr>
-              <w:t>Контекстная диаграмма: внешние системы и акторы</w:t>
-            </w:r>
-          </w:p>
-        </w:tc>
-      </w:tr>
-      <w:tr>
-        <w:tc>
-          <w:tcPr>
-            <w:tcW w:type="dxa" w:w="2409"/>
-          </w:tcPr>
-          <w:p>
-            <w:r>
-              <w:rPr>
-                <w:sz w:val="18"/>
-              </w:rPr>
-              <w:t>d2_c4_container.mmd</w:t>
-            </w:r>
-          </w:p>
-        </w:tc>
-        <w:tc>
-          <w:tcPr>
-            <w:tcW w:type="dxa" w:w="2409"/>
-          </w:tcPr>
-          <w:p>
-            <w:r>
-              <w:rPr>
-                <w:sz w:val="18"/>
-              </w:rPr>
-              <w:t>C4 Level 2</w:t>
-            </w:r>
-          </w:p>
-        </w:tc>
-        <w:tc>
-          <w:tcPr>
-            <w:tcW w:type="dxa" w:w="2409"/>
-          </w:tcPr>
-          <w:p>
-            <w:r>
-              <w:rPr>
-                <w:sz w:val="18"/>
-              </w:rPr>
-              <w:t>C4 Container</w:t>
-            </w:r>
-          </w:p>
-        </w:tc>
-        <w:tc>
-          <w:tcPr>
-            <w:tcW w:type="dxa" w:w="2409"/>
-          </w:tcPr>
-          <w:p>
-            <w:r>
-              <w:rPr>
-                <w:sz w:val="18"/>
-              </w:rPr>
-              <w:t>Контейнеры: API, BatchProcessor, сервисы, БД</w:t>
-            </w:r>
-          </w:p>
-        </w:tc>
-      </w:tr>
-      <w:tr>
-        <w:tc>
-          <w:tcPr>
-            <w:tcW w:type="dxa" w:w="2409"/>
-          </w:tcPr>
-          <w:p>
-            <w:r>
-              <w:rPr>
-                <w:sz w:val="18"/>
-              </w:rPr>
-              <w:t>d3_state_trade.mmd</w:t>
-            </w:r>
-          </w:p>
-        </w:tc>
-        <w:tc>
-          <w:tcPr>
-            <w:tcW w:type="dxa" w:w="2409"/>
-          </w:tcPr>
-          <w:p>
-            <w:r>
-              <w:rPr>
-                <w:sz w:val="18"/>
-              </w:rPr>
-              <w:t>UML State</w:t>
-            </w:r>
-          </w:p>
-        </w:tc>
-        <w:tc>
-          <w:tcPr>
-            <w:tcW w:type="dxa" w:w="2409"/>
-          </w:tcPr>
-          <w:p>
-            <w:r>
-              <w:rPr>
-                <w:sz w:val="18"/>
-              </w:rPr>
-              <w:t>stateDiagram</w:t>
-            </w:r>
-          </w:p>
-        </w:tc>
-        <w:tc>
-          <w:tcPr>
-            <w:tcW w:type="dxa" w:w="2409"/>
-          </w:tcPr>
-          <w:p>
-            <w:r>
-              <w:rPr>
-                <w:sz w:val="18"/>
-              </w:rPr>
-              <w:t>Жизненный цикл сделки РЕПО (NEW→ACTIVE→CLOSED)</w:t>
-            </w:r>
-          </w:p>
-        </w:tc>
-      </w:tr>
-      <w:tr>
-        <w:tc>
-          <w:tcPr>
-            <w:tcW w:type="dxa" w:w="2409"/>
-          </w:tcPr>
-          <w:p>
-            <w:r>
-              <w:rPr>
-                <w:sz w:val="18"/>
-              </w:rPr>
-              <w:t>d4_seq_batch.mmd</w:t>
-            </w:r>
-          </w:p>
-        </w:tc>
-        <w:tc>
-          <w:tcPr>
-            <w:tcW w:type="dxa" w:w="2409"/>
-          </w:tcPr>
-          <w:p>
-            <w:r>
-              <w:rPr>
-                <w:sz w:val="18"/>
-              </w:rPr>
-              <w:t>UML Sequence</w:t>
-            </w:r>
-          </w:p>
-        </w:tc>
-        <w:tc>
-          <w:tcPr>
-            <w:tcW w:type="dxa" w:w="2409"/>
-          </w:tcPr>
-          <w:p>
-            <w:r>
-              <w:rPr>
-                <w:sz w:val="18"/>
-              </w:rPr>
-              <w:t>sequenceDiagram</w:t>
-            </w:r>
-          </w:p>
-        </w:tc>
-        <w:tc>
-          <w:tcPr>
-            <w:tcW w:type="dxa" w:w="2409"/>
-          </w:tcPr>
-          <w:p>
-            <w:r>
-              <w:rPr>
-                <w:sz w:val="18"/>
-              </w:rPr>
-              <w:t>Ночная пакетная загрузка (чанки, SAVEPOINT)</w:t>
-            </w:r>
-          </w:p>
-        </w:tc>
-      </w:tr>
-      <w:tr>
-        <w:tc>
-          <w:tcPr>
-            <w:tcW w:type="dxa" w:w="2409"/>
-          </w:tcPr>
-          <w:p>
-            <w:r>
-              <w:rPr>
-                <w:sz w:val="18"/>
-              </w:rPr>
-              <w:t>d5_er_model.mmd</w:t>
-            </w:r>
-          </w:p>
-        </w:tc>
-        <w:tc>
-          <w:tcPr>
-            <w:tcW w:type="dxa" w:w="2409"/>
-          </w:tcPr>
-          <w:p>
-            <w:r>
-              <w:rPr>
-                <w:sz w:val="18"/>
-              </w:rPr>
-              <w:t>ER-диаграмма</w:t>
-            </w:r>
-          </w:p>
-        </w:tc>
-        <w:tc>
-          <w:tcPr>
-            <w:tcW w:type="dxa" w:w="2409"/>
-          </w:tcPr>
-          <w:p>
-            <w:r>
-              <w:rPr>
-                <w:sz w:val="18"/>
-              </w:rPr>
-              <w:t>erDiagram</w:t>
-            </w:r>
-          </w:p>
-        </w:tc>
-        <w:tc>
-          <w:tcPr>
-            <w:tcW w:type="dxa" w:w="2409"/>
-          </w:tcPr>
-          <w:p>
-            <w:r>
-              <w:rPr>
-                <w:sz w:val="18"/>
-              </w:rPr>
-              <w:t>Модель данных: все таблицы и связи</w:t>
-            </w:r>
-          </w:p>
-        </w:tc>
-      </w:tr>
-      <w:tr>
-        <w:tc>
-          <w:tcPr>
-            <w:tcW w:type="dxa" w:w="2409"/>
-          </w:tcPr>
-          <w:p>
-            <w:r>
-              <w:rPr>
-                <w:sz w:val="18"/>
-              </w:rPr>
-              <w:t>d6_flow_eod.mmd</w:t>
-            </w:r>
-          </w:p>
-        </w:tc>
-        <w:tc>
-          <w:tcPr>
-            <w:tcW w:type="dxa" w:w="2409"/>
-          </w:tcPr>
-          <w:p>
-            <w:r>
-              <w:rPr>
-                <w:sz w:val="18"/>
-              </w:rPr>
-              <w:t>Flowchart</w:t>
-            </w:r>
-          </w:p>
-        </w:tc>
-        <w:tc>
-          <w:tcPr>
-            <w:tcW w:type="dxa" w:w="2409"/>
-          </w:tcPr>
-          <w:p>
-            <w:r>
-              <w:rPr>
-                <w:sz w:val="18"/>
-              </w:rPr>
-              <w:t>flowchart TD</w:t>
-            </w:r>
-          </w:p>
-        </w:tc>
-        <w:tc>
-          <w:tcPr>
-            <w:tcW w:type="dxa" w:w="2409"/>
-          </w:tcPr>
-          <w:p>
-            <w:r>
-              <w:rPr>
-                <w:sz w:val="18"/>
-              </w:rPr>
-              <w:t>EOD-расчёт: SOD → Leg1 → Leg2 → отчёт</w:t>
-            </w:r>
-          </w:p>
-        </w:tc>
-      </w:tr>
-      <w:tr>
-        <w:tc>
-          <w:tcPr>
-            <w:tcW w:type="dxa" w:w="2409"/>
-          </w:tcPr>
-          <w:p>
-            <w:r>
-              <w:rPr>
-                <w:sz w:val="18"/>
-              </w:rPr>
-              <w:t>d7_seq_record.mmd</w:t>
-            </w:r>
-          </w:p>
-        </w:tc>
-        <w:tc>
-          <w:tcPr>
-            <w:tcW w:type="dxa" w:w="2409"/>
-          </w:tcPr>
-          <w:p>
-            <w:r>
-              <w:rPr>
-                <w:sz w:val="18"/>
-              </w:rPr>
-              <w:t>UML Sequence</w:t>
-            </w:r>
-          </w:p>
-        </w:tc>
-        <w:tc>
-          <w:tcPr>
-            <w:tcW w:type="dxa" w:w="2409"/>
-          </w:tcPr>
-          <w:p>
-            <w:r>
-              <w:rPr>
-                <w:sz w:val="18"/>
-              </w:rPr>
-              <w:t>sequenceDiagram</w:t>
-            </w:r>
-          </w:p>
-        </w:tc>
-        <w:tc>
-          <w:tcPr>
-            <w:tcW w:type="dxa" w:w="2409"/>
-          </w:tcPr>
-          <w:p>
-            <w:r>
-              <w:rPr>
-                <w:sz w:val="18"/>
-              </w:rPr>
-              <w:t>Обработка одной записи внутри SAVEPOINT</w:t>
-            </w:r>
-          </w:p>
-        </w:tc>
-      </w:tr>
-      <w:tr>
-        <w:tc>
-          <w:tcPr>
-            <w:tcW w:type="dxa" w:w="2409"/>
-          </w:tcPr>
-          <w:p>
-            <w:r>
-              <w:rPr>
-                <w:sz w:val="18"/>
-              </w:rPr>
-              <w:t>d8_c4_component.mmd</w:t>
-            </w:r>
-          </w:p>
-        </w:tc>
-        <w:tc>
-          <w:tcPr>
-            <w:tcW w:type="dxa" w:w="2409"/>
-          </w:tcPr>
-          <w:p>
-            <w:r>
-              <w:rPr>
-                <w:sz w:val="18"/>
-              </w:rPr>
-              <w:t>C4 Level 3</w:t>
-            </w:r>
-          </w:p>
-        </w:tc>
-        <w:tc>
-          <w:tcPr>
-            <w:tcW w:type="dxa" w:w="2409"/>
-          </w:tcPr>
-          <w:p>
-            <w:r>
-              <w:rPr>
-                <w:sz w:val="18"/>
-              </w:rPr>
-              <w:t>C4 Component</w:t>
-            </w:r>
-          </w:p>
-        </w:tc>
-        <w:tc>
-          <w:tcPr>
-            <w:tcW w:type="dxa" w:w="2409"/>
-          </w:tcPr>
-          <w:p>
-            <w:r>
-              <w:rPr>
-                <w:sz w:val="18"/>
-              </w:rPr>
-              <w:t>Компоненты модуля и их зависимости</w:t>
-            </w:r>
-          </w:p>
-        </w:tc>
-      </w:tr>
-    </w:tbl>
-    <w:p>
-      <w:pPr>
-        <w:pStyle w:val="Heading2"/>
-      </w:pPr>
-      <w:r>
-        <w:t>15.2 D1 — Контекстная диаграмма (C4 Level 1)</w:t>
-      </w:r>
-    </w:p>
-    <w:p>
-      <w:r>
-        <w:rPr>
-          <w:b w:val="0"/>
-          <w:i w:val="0"/>
-          <w:sz w:val="20"/>
-        </w:rPr>
-        <w:t>Показывает Модуль РЕПО в контексте взаимодействующих внешних систем: Торговой системы (источник сделок), Расчётной системы НКЦ (SOD-остатки, подтверждения Leg 2), Депозитария (справочники), Системы мониторинга и Оператора.</w:t>
-      </w:r>
-    </w:p>
-    <w:p>
-      <w:r>
-        <w:rPr>
-          <w:b w:val="0"/>
-          <w:i/>
-          <w:sz w:val="18"/>
-        </w:rPr>
-        <w:t>Файл: d1_c4_context.mmd</w:t>
-      </w:r>
-    </w:p>
-    <w:p>
-      <w:pPr>
-        <w:pStyle w:val="Heading2"/>
-      </w:pPr>
-      <w:r>
-        <w:t>15.3 D2 — Диаграмма контейнеров (C4 Level 2)</w:t>
-      </w:r>
-    </w:p>
-    <w:p>
-      <w:r>
-        <w:rPr>
-          <w:b w:val="0"/>
-          <w:i w:val="0"/>
-          <w:sz w:val="20"/>
-        </w:rPr>
-        <w:t>Раскрывает внутреннюю структуру Модуля РЕПО. Ключевые контейнеры:</w:t>
-      </w:r>
-    </w:p>
-    <w:tbl>
-      <w:tblPr>
-        <w:tblW w:type="auto" w:w="0"/>
-        <w:tblLook w:firstColumn="1" w:firstRow="1" w:lastColumn="0" w:lastRow="0" w:noHBand="0" w:noVBand="1" w:val="04A0"/>
-      </w:tblPr>
-      <w:tblGrid>
-        <w:gridCol w:w="4819"/>
-        <w:gridCol w:w="4819"/>
-      </w:tblGrid>
-      <w:tr>
-        <w:tc>
-          <w:tcPr>
-            <w:tcW w:type="dxa" w:w="4819"/>
-            <w:shd w:val="clear" w:color="auto" w:fill="1F4E79"/>
-          </w:tcPr>
-          <w:p>
-            <w:r>
-              <w:rPr>
-                <w:b/>
-                <w:color w:val="FFFFFF"/>
-                <w:sz w:val="18"/>
-              </w:rPr>
-              <w:t>Контейнер</w:t>
-            </w:r>
-          </w:p>
-        </w:tc>
-        <w:tc>
-          <w:tcPr>
-            <w:tcW w:type="dxa" w:w="4819"/>
-            <w:shd w:val="clear" w:color="auto" w:fill="1F4E79"/>
-          </w:tcPr>
-          <w:p>
-            <w:r>
-              <w:rPr>
-                <w:b/>
-                <w:color w:val="FFFFFF"/>
-                <w:sz w:val="18"/>
-              </w:rPr>
-              <w:t>Назначение</w:t>
-            </w:r>
-          </w:p>
-        </w:tc>
-      </w:tr>
-      <w:tr>
-        <w:tc>
-          <w:tcPr>
-            <w:tcW w:type="dxa" w:w="4819"/>
-          </w:tcPr>
-          <w:p>
-            <w:r>
-              <w:rPr>
-                <w:sz w:val="18"/>
-              </w:rPr>
-              <w:t>REST API (FastAPI + Uvicorn)</w:t>
-            </w:r>
-          </w:p>
-        </w:tc>
-        <w:tc>
-          <w:tcPr>
-            <w:tcW w:type="dxa" w:w="4819"/>
-          </w:tcPr>
-          <w:p>
-            <w:r>
-              <w:rPr>
-                <w:sz w:val="18"/>
-              </w:rPr>
-              <w:t>GET /trades, /positions, /obligations, /reports; DELETE /trades/{id}; POST /batch/load</w:t>
-            </w:r>
-          </w:p>
-        </w:tc>
-      </w:tr>
-      <w:tr>
-        <w:tc>
-          <w:tcPr>
-            <w:tcW w:type="dxa" w:w="4819"/>
-          </w:tcPr>
-          <w:p>
-            <w:r>
-              <w:rPr>
-                <w:sz w:val="18"/>
-              </w:rPr>
-              <w:t>BatchProcessor (batch/processor.py)</w:t>
-            </w:r>
-          </w:p>
-        </w:tc>
-        <w:tc>
-          <w:tcPr>
-            <w:tcW w:type="dxa" w:w="4819"/>
-          </w:tcPr>
-          <w:p>
-            <w:r>
-              <w:rPr>
-                <w:sz w:val="18"/>
-              </w:rPr>
-              <w:t>Чанковая обработка JSON Lines. SAVEPOINT на запись (бизнес-ошибки). ROLLBACK чанка (системные ошибки). Повтор до 3 раз.</w:t>
-            </w:r>
-          </w:p>
-        </w:tc>
-      </w:tr>
-      <w:tr>
-        <w:tc>
-          <w:tcPr>
-            <w:tcW w:type="dxa" w:w="4819"/>
-          </w:tcPr>
-          <w:p>
-            <w:r>
-              <w:rPr>
-                <w:sz w:val="18"/>
-              </w:rPr>
-              <w:t>TradeService (services/trade_service.py)</w:t>
-            </w:r>
-          </w:p>
-        </w:tc>
-        <w:tc>
-          <w:tcPr>
-            <w:tcW w:type="dxa" w:w="4819"/>
-          </w:tcPr>
-          <w:p>
-            <w:r>
-              <w:rPr>
-                <w:sz w:val="18"/>
-              </w:rPr>
-              <w:t>Маппинг ролей party_1/party_2. Fallback DEFAULT_SELLER. Валидация справочников. Расчёт leg2_amount (HALF_UP).</w:t>
-            </w:r>
-          </w:p>
-        </w:tc>
-      </w:tr>
-      <w:tr>
-        <w:tc>
-          <w:tcPr>
-            <w:tcW w:type="dxa" w:w="4819"/>
-          </w:tcPr>
-          <w:p>
-            <w:r>
-              <w:rPr>
-                <w:sz w:val="18"/>
-              </w:rPr>
-              <w:t>PositionService (services/position_service.py)</w:t>
-            </w:r>
-          </w:p>
-        </w:tc>
-        <w:tc>
-          <w:tcPr>
-            <w:tcW w:type="dxa" w:w="4819"/>
-          </w:tcPr>
-          <w:p>
-            <w:r>
-              <w:rPr>
-                <w:sz w:val="18"/>
-              </w:rPr>
-              <w:t>Pre-check balance &gt;= 0 (1-й рубеж). Применение дельт Leg 1/Leg 2. Future Obligations. Аудит-лог (SHA-256 hash-chain).</w:t>
-            </w:r>
-          </w:p>
-        </w:tc>
-      </w:tr>
-      <w:tr>
-        <w:tc>
-          <w:tcPr>
-            <w:tcW w:type="dxa" w:w="4819"/>
-          </w:tcPr>
-          <w:p>
-            <w:r>
-              <w:rPr>
-                <w:sz w:val="18"/>
-              </w:rPr>
-              <w:t>SQLite (демо-режим, aiosqlite)</w:t>
-            </w:r>
-          </w:p>
-        </w:tc>
-        <w:tc>
-          <w:tcPr>
-            <w:tcW w:type="dxa" w:w="4819"/>
-          </w:tcPr>
-          <w:p>
-            <w:r>
-              <w:rPr>
-                <w:sz w:val="18"/>
-              </w:rPr>
-              <w:t>Полная эмуляция без внешних зависимостей. CHECK balance&gt;=0 через BEFORE INSERT/UPDATE триггеры. MODE=demo.</w:t>
-            </w:r>
-          </w:p>
-        </w:tc>
-      </w:tr>
-      <w:tr>
-        <w:tc>
-          <w:tcPr>
-            <w:tcW w:type="dxa" w:w="4819"/>
-          </w:tcPr>
-          <w:p>
-            <w:r>
-              <w:rPr>
-                <w:sz w:val="18"/>
-              </w:rPr>
-              <w:t>PostgreSQL 15+ (прод-режим, asyncpg)</w:t>
-            </w:r>
-          </w:p>
-        </w:tc>
-        <w:tc>
-          <w:tcPr>
-            <w:tcW w:type="dxa" w:w="4819"/>
-          </w:tcPr>
-          <w:p>
-            <w:r>
-              <w:rPr>
-                <w:sz w:val="18"/>
-              </w:rPr>
-              <w:t>Партиционирование raw_trades. Нативный CHECK constraint. JSONB. MODE=production.</w:t>
-            </w:r>
-          </w:p>
-        </w:tc>
-      </w:tr>
-    </w:tbl>
-    <w:p>
-      <w:r>
-        <w:rPr>
-          <w:b w:val="0"/>
-          <w:i/>
-          <w:sz w:val="18"/>
-        </w:rPr>
-        <w:t>Файл: d2_c4_container.mmd</w:t>
-      </w:r>
-    </w:p>
-    <w:p>
-      <w:pPr>
-        <w:pStyle w:val="Heading2"/>
-      </w:pPr>
-      <w:r>
-        <w:t>15.4 D3 — Жизненный цикл сделки (UML State)</w:t>
-      </w:r>
-    </w:p>
-    <w:p>
-      <w:r>
-        <w:rPr>
-          <w:b w:val="0"/>
-          <w:i w:val="0"/>
-          <w:sz w:val="20"/>
-        </w:rPr>
-        <w:t>Диаграмма состояний сделки РЕПО. В batch-режиме (MVP) сделка сразу переходит в статус ACTIVE, минуя NEW, поскольку trade_date = leg1_settlement_date = EOD-дата.</w:t>
-      </w:r>
-    </w:p>
-    <w:tbl>
-      <w:tblPr>
-        <w:tblW w:type="auto" w:w="0"/>
-        <w:tblLook w:firstColumn="1" w:firstRow="1" w:lastColumn="0" w:lastRow="0" w:noHBand="0" w:noVBand="1" w:val="04A0"/>
-      </w:tblPr>
-      <w:tblGrid>
-        <w:gridCol w:w="4819"/>
-        <w:gridCol w:w="4819"/>
-      </w:tblGrid>
-      <w:tr>
-        <w:tc>
-          <w:tcPr>
-            <w:tcW w:type="dxa" w:w="4819"/>
-            <w:shd w:val="clear" w:color="auto" w:fill="1F4E79"/>
-          </w:tcPr>
-          <w:p>
-            <w:r>
-              <w:rPr>
-                <w:b/>
-                <w:color w:val="FFFFFF"/>
-                <w:sz w:val="18"/>
-              </w:rPr>
-              <w:t>Переход</w:t>
-            </w:r>
-          </w:p>
-        </w:tc>
-        <w:tc>
-          <w:tcPr>
-            <w:tcW w:type="dxa" w:w="4819"/>
-            <w:shd w:val="clear" w:color="auto" w:fill="1F4E79"/>
-          </w:tcPr>
-          <w:p>
-            <w:r>
-              <w:rPr>
-                <w:b/>
-                <w:color w:val="FFFFFF"/>
-                <w:sz w:val="18"/>
-              </w:rPr>
-              <w:t>Условие / действие</w:t>
-            </w:r>
-          </w:p>
-        </w:tc>
-      </w:tr>
-      <w:tr>
-        <w:tc>
-          <w:tcPr>
-            <w:tcW w:type="dxa" w:w="4819"/>
-          </w:tcPr>
-          <w:p>
-            <w:r>
-              <w:rPr>
-                <w:sz w:val="18"/>
-              </w:rPr>
-              <w:t>NEW → ACTIVE</w:t>
-            </w:r>
-          </w:p>
-        </w:tc>
-        <w:tc>
-          <w:tcPr>
-            <w:tcW w:type="dxa" w:w="4819"/>
-          </w:tcPr>
-          <w:p>
-            <w:r>
-              <w:rPr>
-                <w:sz w:val="18"/>
-              </w:rPr>
-              <w:t>trade_date = EOD-дата, pre-check OK, проводки Leg 1 применены</w:t>
-            </w:r>
-          </w:p>
-        </w:tc>
-      </w:tr>
-      <w:tr>
-        <w:tc>
-          <w:tcPr>
-            <w:tcW w:type="dxa" w:w="4819"/>
-          </w:tcPr>
-          <w:p>
-            <w:r>
-              <w:rPr>
-                <w:sz w:val="18"/>
-              </w:rPr>
-              <w:t>NEW → CANCELLED</w:t>
-            </w:r>
-          </w:p>
-        </w:tc>
-        <w:tc>
-          <w:tcPr>
-            <w:tcW w:type="dxa" w:w="4819"/>
-          </w:tcPr>
-          <w:p>
-            <w:r>
-              <w:rPr>
-                <w:sz w:val="18"/>
-              </w:rPr>
-              <w:t>DELETE /trades/{id}, current_date &lt; leg1_settlement_date</w:t>
-            </w:r>
-          </w:p>
-        </w:tc>
-      </w:tr>
-      <w:tr>
-        <w:tc>
-          <w:tcPr>
-            <w:tcW w:type="dxa" w:w="4819"/>
-          </w:tcPr>
-          <w:p>
-            <w:r>
-              <w:rPr>
-                <w:sz w:val="18"/>
-              </w:rPr>
-              <w:t>NEW → REJECTED</w:t>
-            </w:r>
-          </w:p>
-        </w:tc>
-        <w:tc>
-          <w:tcPr>
-            <w:tcW w:type="dxa" w:w="4819"/>
-          </w:tcPr>
-          <w:p>
-            <w:r>
-              <w:rPr>
-                <w:sz w:val="18"/>
-              </w:rPr>
-              <w:t>Pre-check FAIL (INSUFFICIENT_BALANCE) или VALIDATION_ERROR</w:t>
-            </w:r>
-          </w:p>
-        </w:tc>
-      </w:tr>
-      <w:tr>
-        <w:tc>
-          <w:tcPr>
-            <w:tcW w:type="dxa" w:w="4819"/>
-          </w:tcPr>
-          <w:p>
-            <w:r>
-              <w:rPr>
-                <w:sz w:val="18"/>
-              </w:rPr>
-              <w:t>ACTIVE → CLOSED</w:t>
-            </w:r>
-          </w:p>
-        </w:tc>
-        <w:tc>
-          <w:tcPr>
-            <w:tcW w:type="dxa" w:w="4819"/>
-          </w:tcPr>
-          <w:p>
-            <w:r>
-              <w:rPr>
-                <w:sz w:val="18"/>
-              </w:rPr>
-              <w:t>LEG2_SETTLED получен, проводки Leg 2 применены</w:t>
-            </w:r>
-          </w:p>
-        </w:tc>
-      </w:tr>
-      <w:tr>
-        <w:tc>
-          <w:tcPr>
-            <w:tcW w:type="dxa" w:w="4819"/>
-          </w:tcPr>
-          <w:p>
-            <w:r>
-              <w:rPr>
-                <w:sz w:val="18"/>
-              </w:rPr>
-              <w:t>ACTIVE → DEFAULTED</w:t>
-            </w:r>
-          </w:p>
-        </w:tc>
-        <w:tc>
-          <w:tcPr>
-            <w:tcW w:type="dxa" w:w="4819"/>
-          </w:tcPr>
-          <w:p>
-            <w:r>
-              <w:rPr>
-                <w:sz w:val="18"/>
-              </w:rPr>
-              <w:t>[Этап 2] LEG2_FAILED — ручной разбор в MVP</w:t>
-            </w:r>
-          </w:p>
-        </w:tc>
-      </w:tr>
-      <w:tr>
-        <w:tc>
-          <w:tcPr>
-            <w:tcW w:type="dxa" w:w="4819"/>
-          </w:tcPr>
-          <w:p>
-            <w:r>
-              <w:rPr>
-                <w:sz w:val="18"/>
-              </w:rPr>
-              <w:t>ACTIVE → EARLY_TERMINATED</w:t>
-            </w:r>
-          </w:p>
-        </w:tc>
-        <w:tc>
-          <w:tcPr>
-            <w:tcW w:type="dxa" w:w="4819"/>
-          </w:tcPr>
-          <w:p>
-            <w:r>
-              <w:rPr>
-                <w:sz w:val="18"/>
-              </w:rPr>
-              <w:t>[Этап 2] Досрочное закрытие</w:t>
-            </w:r>
-          </w:p>
-        </w:tc>
-      </w:tr>
-    </w:tbl>
-    <w:p>
-      <w:r>
-        <w:rPr>
-          <w:b w:val="0"/>
-          <w:i/>
-          <w:sz w:val="18"/>
-        </w:rPr>
-        <w:t>Файл: d3_state_trade.mmd</w:t>
-      </w:r>
-    </w:p>
-    <w:p>
-      <w:pPr>
-        <w:pStyle w:val="Heading2"/>
-      </w:pPr>
-      <w:r>
-        <w:t>15.5 D4 — Ночная пакетная загрузка (UML Sequence)</w:t>
-      </w:r>
-    </w:p>
-    <w:p>
-      <w:r>
-        <w:rPr>
-          <w:b w:val="0"/>
-          <w:i w:val="0"/>
-          <w:sz w:val="20"/>
-        </w:rPr>
-        <w:t>Детальная последовательность ночной пакетной загрузки. Участники: BatchProcessor, TradeService, PositionService, БД, Мониторинг.</w:t>
-      </w:r>
-    </w:p>
-    <w:p>
-      <w:r>
-        <w:rPr>
-          <w:b/>
-          <w:i w:val="0"/>
-          <w:sz w:val="20"/>
-        </w:rPr>
-        <w:t>Алгоритм обработки чанка:</w:t>
-      </w:r>
-    </w:p>
-    <w:p>
-      <w:pPr>
-        <w:pStyle w:val="ListParagraph"/>
-      </w:pPr>
-      <w:r>
-        <w:rPr>
-          <w:sz w:val="18"/>
-        </w:rPr>
-        <w:t>1. BEGIN TRANSACTION (чанк)</w:t>
-      </w:r>
-    </w:p>
-    <w:p>
-      <w:pPr>
-        <w:pStyle w:val="ListParagraph"/>
-      </w:pPr>
-      <w:r>
-        <w:rPr>
-          <w:sz w:val="18"/>
-        </w:rPr>
-        <w:t>2. Для каждой записи: SAVEPOINT sp_record_{chunk}_{n}</w:t>
-      </w:r>
-    </w:p>
-    <w:p>
-      <w:pPr>
-        <w:pStyle w:val="ListParagraph"/>
-      </w:pPr>
-      <w:r>
-        <w:rPr>
-          <w:sz w:val="18"/>
-        </w:rPr>
-        <w:t>3. Парсинг JSON → IncomingTrade (Pydantic-валидация)</w:t>
-      </w:r>
-    </w:p>
-    <w:p>
-      <w:pPr>
-        <w:pStyle w:val="ListParagraph"/>
-      </w:pPr>
-      <w:r>
-        <w:rPr>
-          <w:sz w:val="18"/>
-        </w:rPr>
-        <w:t>4. Dedup-проверка по idempotency_key (external_trade_id + trade_date)</w:t>
-      </w:r>
-    </w:p>
-    <w:p>
-      <w:pPr>
-        <w:pStyle w:val="ListParagraph"/>
-      </w:pPr>
-      <w:r>
-        <w:rPr>
-          <w:sz w:val="18"/>
-        </w:rPr>
-        <w:t>5. validate_trade(): проверка Participant и Instrument в справочниках</w:t>
-      </w:r>
-    </w:p>
-    <w:p>
-      <w:pPr>
-        <w:pStyle w:val="ListParagraph"/>
-      </w:pPr>
-      <w:r>
-        <w:rPr>
-          <w:sz w:val="18"/>
-        </w:rPr>
-        <w:t>6. map_roles(): SECURITY_SELLER / SECURITY_BUYER / DEFAULT_SELLER (fallback + WARNING)</w:t>
-      </w:r>
-    </w:p>
-    <w:p>
-      <w:pPr>
-        <w:pStyle w:val="ListParagraph"/>
-      </w:pPr>
-      <w:r>
-        <w:rPr>
-          <w:sz w:val="18"/>
-        </w:rPr>
-        <w:t>7. calculate_leg2_amount(): ROUND(sum*rate*days/365, 2, HALF_UP)</w:t>
-      </w:r>
-    </w:p>
-    <w:p>
-      <w:pPr>
-        <w:pStyle w:val="ListParagraph"/>
-      </w:pPr>
-      <w:r>
-        <w:rPr>
-          <w:sz w:val="18"/>
-        </w:rPr>
-        <w:t>8. Pre-check: SELECT balance FOR UPDATE → проверка balance + delta &gt;= 0</w:t>
-      </w:r>
-    </w:p>
-    <w:p>
-      <w:pPr>
-        <w:pStyle w:val="ListParagraph"/>
-      </w:pPr>
-      <w:r>
-        <w:rPr>
-          <w:sz w:val="18"/>
-        </w:rPr>
-        <w:t>9. INSERT raw_trades, INSERT trades, UPDATE positions, INSERT audit_log, INSERT obligations</w:t>
-      </w:r>
-    </w:p>
-    <w:p>
-      <w:pPr>
-        <w:pStyle w:val="ListParagraph"/>
-      </w:pPr>
-      <w:r>
-        <w:rPr>
-          <w:sz w:val="18"/>
-        </w:rPr>
-        <w:t>10. RELEASE SAVEPOINT → committed++</w:t>
-      </w:r>
-    </w:p>
-    <w:p>
-      <w:pPr>
-        <w:pStyle w:val="ListParagraph"/>
-      </w:pPr>
-      <w:r>
-        <w:rPr>
-          <w:sz w:val="18"/>
-        </w:rPr>
-        <w:t>Бизнес-ошибка (шаги 3–8): ROLLBACK TO SAVEPOINT → rejected_trades → CONTINUE</w:t>
-      </w:r>
-    </w:p>
-    <w:p>
-      <w:pPr>
-        <w:pStyle w:val="ListParagraph"/>
-      </w:pPr>
-      <w:r>
-        <w:rPr>
-          <w:sz w:val="18"/>
-        </w:rPr>
-        <w:t>Системная ошибка: ROLLBACK чанка → повтор до max_retries=3 → failed_chunks++</w:t>
-      </w:r>
-    </w:p>
-    <w:p>
-      <w:pPr>
-        <w:pStyle w:val="ListParagraph"/>
-      </w:pPr>
-      <w:r>
-        <w:rPr>
-          <w:sz w:val="18"/>
-        </w:rPr>
-        <w:t>11. COMMIT чанка</w:t>
-      </w:r>
-    </w:p>
-    <w:p>
-      <w:r>
-        <w:rPr>
-          <w:b w:val="0"/>
-          <w:i/>
-          <w:sz w:val="18"/>
-        </w:rPr>
-        <w:t>Файл: d4_seq_batch.mmd</w:t>
-      </w:r>
-    </w:p>
-    <w:p>
-      <w:pPr>
-        <w:pStyle w:val="Heading2"/>
-      </w:pPr>
-      <w:r>
-        <w:t>15.6 D5 — ER-модель данных</w:t>
-      </w:r>
-    </w:p>
-    <w:p>
-      <w:r>
-        <w:rPr>
-          <w:b w:val="0"/>
-          <w:i w:val="0"/>
-          <w:sz w:val="20"/>
-        </w:rPr>
-        <w:t>Реляционная модель данных Модуля РЕПО. Типы данных адаптированы для двух режимов: PostgreSQL (UUID, JSONB, BIGSERIAL, DECIMAL) и SQLite (TEXT, JSON, INTEGER, REAL).</w:t>
-      </w:r>
-    </w:p>
-    <w:tbl>
-      <w:tblPr>
-        <w:tblW w:type="auto" w:w="0"/>
-        <w:tblLook w:firstColumn="1" w:firstRow="1" w:lastColumn="0" w:lastRow="0" w:noHBand="0" w:noVBand="1" w:val="04A0"/>
-      </w:tblPr>
-      <w:tblGrid>
-        <w:gridCol w:w="4819"/>
-        <w:gridCol w:w="4819"/>
-      </w:tblGrid>
-      <w:tr>
-        <w:tc>
-          <w:tcPr>
-            <w:tcW w:type="dxa" w:w="4819"/>
-            <w:shd w:val="clear" w:color="auto" w:fill="1F4E79"/>
-          </w:tcPr>
-          <w:p>
-            <w:r>
-              <w:rPr>
-                <w:b/>
-                <w:color w:val="FFFFFF"/>
-                <w:sz w:val="18"/>
-              </w:rPr>
-              <w:t>Таблица</w:t>
-            </w:r>
-          </w:p>
-        </w:tc>
-        <w:tc>
-          <w:tcPr>
-            <w:tcW w:type="dxa" w:w="4819"/>
-            <w:shd w:val="clear" w:color="auto" w:fill="1F4E79"/>
-          </w:tcPr>
-          <w:p>
-            <w:r>
-              <w:rPr>
-                <w:b/>
-                <w:color w:val="FFFFFF"/>
-                <w:sz w:val="18"/>
-              </w:rPr>
-              <w:t>Назначение</w:t>
-            </w:r>
-          </w:p>
-        </w:tc>
-      </w:tr>
-      <w:tr>
-        <w:tc>
-          <w:tcPr>
-            <w:tcW w:type="dxa" w:w="4819"/>
-          </w:tcPr>
-          <w:p>
-            <w:r>
-              <w:rPr>
-                <w:sz w:val="18"/>
-              </w:rPr>
-              <w:t>participants</w:t>
-            </w:r>
-          </w:p>
-        </w:tc>
-        <w:tc>
-          <w:tcPr>
-            <w:tcW w:type="dxa" w:w="4819"/>
-          </w:tcPr>
-          <w:p>
-            <w:r>
-              <w:rPr>
-                <w:sz w:val="18"/>
-              </w:rPr>
-              <w:t>Справочник участников клиринга</w:t>
-            </w:r>
-          </w:p>
-        </w:tc>
-      </w:tr>
-      <w:tr>
-        <w:tc>
-          <w:tcPr>
-            <w:tcW w:type="dxa" w:w="4819"/>
-          </w:tcPr>
-          <w:p>
-            <w:r>
-              <w:rPr>
-                <w:sz w:val="18"/>
-              </w:rPr>
-              <w:t>instruments</w:t>
-            </w:r>
-          </w:p>
-        </w:tc>
-        <w:tc>
-          <w:tcPr>
-            <w:tcW w:type="dxa" w:w="4819"/>
-          </w:tcPr>
-          <w:p>
-            <w:r>
-              <w:rPr>
-                <w:sz w:val="18"/>
-              </w:rPr>
-              <w:t>Справочник инструментов (ISIN, repo_eligible, day_count_convention)</w:t>
-            </w:r>
-          </w:p>
-        </w:tc>
-      </w:tr>
-      <w:tr>
-        <w:tc>
-          <w:tcPr>
-            <w:tcW w:type="dxa" w:w="4819"/>
-          </w:tcPr>
-          <w:p>
-            <w:r>
-              <w:rPr>
-                <w:sz w:val="18"/>
-              </w:rPr>
-              <w:t>raw_trades</w:t>
-            </w:r>
-          </w:p>
-        </w:tc>
-        <w:tc>
-          <w:tcPr>
-            <w:tcW w:type="dxa" w:w="4819"/>
-          </w:tcPr>
-          <w:p>
-            <w:r>
-              <w:rPr>
-                <w:sz w:val="18"/>
-              </w:rPr>
-              <w:t>Неизменяемый журнал входящих записей (append-only, dedup-индекс)</w:t>
-            </w:r>
-          </w:p>
-        </w:tc>
-      </w:tr>
-      <w:tr>
-        <w:tc>
-          <w:tcPr>
-            <w:tcW w:type="dxa" w:w="4819"/>
-          </w:tcPr>
-          <w:p>
-            <w:r>
-              <w:rPr>
-                <w:sz w:val="18"/>
-              </w:rPr>
-              <w:t>trades</w:t>
-            </w:r>
-          </w:p>
-        </w:tc>
-        <w:tc>
-          <w:tcPr>
-            <w:tcW w:type="dxa" w:w="4819"/>
-          </w:tcPr>
-          <w:p>
-            <w:r>
-              <w:rPr>
-                <w:sz w:val="18"/>
-              </w:rPr>
-              <w:t>Обработанные сделки РЕПО (все поля, статус, leg2_amount)</w:t>
-            </w:r>
-          </w:p>
-        </w:tc>
-      </w:tr>
-      <w:tr>
-        <w:tc>
-          <w:tcPr>
-            <w:tcW w:type="dxa" w:w="4819"/>
-          </w:tcPr>
-          <w:p>
-            <w:r>
-              <w:rPr>
-                <w:sz w:val="18"/>
-              </w:rPr>
-              <w:t>positions</w:t>
-            </w:r>
-          </w:p>
-        </w:tc>
-        <w:tc>
-          <w:tcPr>
-            <w:tcW w:type="dxa" w:w="4819"/>
-          </w:tcPr>
-          <w:p>
-            <w:r>
-              <w:rPr>
-                <w:sz w:val="18"/>
-              </w:rPr>
-              <w:t>EOD/SOD позиции участников (CHECK balance &gt;= 0)</w:t>
-            </w:r>
-          </w:p>
-        </w:tc>
-      </w:tr>
-      <w:tr>
-        <w:tc>
-          <w:tcPr>
-            <w:tcW w:type="dxa" w:w="4819"/>
-          </w:tcPr>
-          <w:p>
-            <w:r>
-              <w:rPr>
-                <w:sz w:val="18"/>
-              </w:rPr>
-              <w:t>future_obligations</w:t>
-            </w:r>
-          </w:p>
-        </w:tc>
-        <w:tc>
-          <w:tcPr>
-            <w:tcW w:type="dxa" w:w="4819"/>
-          </w:tcPr>
-          <w:p>
-            <w:r>
-              <w:rPr>
-                <w:sz w:val="18"/>
-              </w:rPr>
-              <w:t>Реестр будущих обязательств по Leg 2 (4 записи на сделку)</w:t>
-            </w:r>
-          </w:p>
-        </w:tc>
-      </w:tr>
-      <w:tr>
-        <w:tc>
-          <w:tcPr>
-            <w:tcW w:type="dxa" w:w="4819"/>
-          </w:tcPr>
-          <w:p>
-            <w:r>
-              <w:rPr>
-                <w:sz w:val="18"/>
-              </w:rPr>
-              <w:t>position_audit_log</w:t>
-            </w:r>
-          </w:p>
-        </w:tc>
-        <w:tc>
-          <w:tcPr>
-            <w:tcW w:type="dxa" w:w="4819"/>
-          </w:tcPr>
-          <w:p>
-            <w:r>
-              <w:rPr>
-                <w:sz w:val="18"/>
-              </w:rPr>
-              <w:t>Аудит-лог изменений позиций (append-only, SHA-256 hash-chain)</w:t>
-            </w:r>
-          </w:p>
-        </w:tc>
-      </w:tr>
-      <w:tr>
-        <w:tc>
-          <w:tcPr>
-            <w:tcW w:type="dxa" w:w="4819"/>
-          </w:tcPr>
-          <w:p>
-            <w:r>
-              <w:rPr>
-                <w:sz w:val="18"/>
-              </w:rPr>
-              <w:t>rejected_trades</w:t>
-            </w:r>
-          </w:p>
-        </w:tc>
-        <w:tc>
-          <w:tcPr>
-            <w:tcW w:type="dxa" w:w="4819"/>
-          </w:tcPr>
-          <w:p>
-            <w:r>
-              <w:rPr>
-                <w:sz w:val="18"/>
-              </w:rPr>
-              <w:t>Отклонённые записи с типом и деталями ошибки</w:t>
-            </w:r>
-          </w:p>
-        </w:tc>
-      </w:tr>
-      <w:tr>
-        <w:tc>
-          <w:tcPr>
-            <w:tcW w:type="dxa" w:w="4819"/>
-          </w:tcPr>
-          <w:p>
-            <w:r>
-              <w:rPr>
-                <w:sz w:val="18"/>
-              </w:rPr>
-              <w:t>load_reports</w:t>
-            </w:r>
-          </w:p>
-        </w:tc>
-        <w:tc>
-          <w:tcPr>
-            <w:tcW w:type="dxa" w:w="4819"/>
-          </w:tcPr>
-          <w:p>
-            <w:r>
-              <w:rPr>
-                <w:sz w:val="18"/>
-              </w:rPr>
-              <w:t>Отчёты о пакетных загрузках (UNIQUE по eod_date)</w:t>
-            </w:r>
-          </w:p>
-        </w:tc>
-      </w:tr>
-    </w:tbl>
-    <w:p>
-      <w:r>
-        <w:rPr>
-          <w:b w:val="0"/>
-          <w:i/>
-          <w:sz w:val="18"/>
-        </w:rPr>
-        <w:t>Файл: d5_er_model.mmd</w:t>
-      </w:r>
-    </w:p>
-    <w:p>
-      <w:pPr>
-        <w:pStyle w:val="Heading2"/>
-      </w:pPr>
-      <w:r>
-        <w:t>15.7 D6 — EOD-расчёт позиций (Flowchart)</w:t>
-      </w:r>
-    </w:p>
-    <w:p>
-      <w:r>
-        <w:rPr>
-          <w:b w:val="0"/>
-          <w:i w:val="0"/>
-          <w:sz w:val="20"/>
-        </w:rPr>
-        <w:t>Блок-схема алгоритма расчёта позиций на конец торгового дня (EOD). Реализована в scripts/run_demo.py и batch/processor.py.</w:t>
-      </w:r>
-    </w:p>
-    <w:p>
-      <w:pPr>
-        <w:pStyle w:val="ListParagraph"/>
-      </w:pPr>
-      <w:r>
-        <w:rPr>
-          <w:sz w:val="18"/>
-        </w:rPr>
-        <w:t>load_sod_balances() — загрузка SOD-остатков в positions (status=SOD)</w:t>
-      </w:r>
-    </w:p>
-    <w:p>
-      <w:pPr>
-        <w:pStyle w:val="ListParagraph"/>
-      </w:pPr>
-      <w:r>
-        <w:rPr>
-          <w:sz w:val="18"/>
-        </w:rPr>
-        <w:t>copy_sod_to_eod() — копирование SOD → EOD как стартовая точка дня</w:t>
-      </w:r>
-    </w:p>
-    <w:p>
-      <w:pPr>
-        <w:pStyle w:val="ListParagraph"/>
-      </w:pPr>
-      <w:r>
-        <w:rPr>
-          <w:sz w:val="18"/>
-        </w:rPr>
-        <w:t>run_batch_load() — пакетная загрузка сделок, применение Leg 1 в процессе</w:t>
-      </w:r>
-    </w:p>
-    <w:p>
-      <w:pPr>
-        <w:pStyle w:val="ListParagraph"/>
-      </w:pPr>
-      <w:r>
-        <w:rPr>
-          <w:sz w:val="18"/>
-        </w:rPr>
-        <w:t>Применение Leg 2 для leg2_settlement_date = D (при наличии LEG2_SETTLED)</w:t>
-      </w:r>
-    </w:p>
-    <w:p>
-      <w:pPr>
-        <w:pStyle w:val="ListParagraph"/>
-      </w:pPr>
-      <w:r>
-        <w:rPr>
-          <w:sz w:val="18"/>
-        </w:rPr>
-        <w:t>Проверка inconsistent-позиций → алерт при наличии</w:t>
-      </w:r>
-    </w:p>
-    <w:p>
-      <w:pPr>
-        <w:pStyle w:val="ListParagraph"/>
-      </w:pPr>
-      <w:r>
-        <w:rPr>
-          <w:sz w:val="18"/>
-        </w:rPr>
-        <w:t>Формирование EOD Position Report (CSV/JSON), Future Obligations Register, Load Report</w:t>
-      </w:r>
-    </w:p>
-    <w:p>
-      <w:r>
-        <w:rPr>
-          <w:b w:val="0"/>
-          <w:i/>
-          <w:sz w:val="18"/>
-        </w:rPr>
-        <w:t>Файл: d6_flow_eod.mmd</w:t>
-      </w:r>
-    </w:p>
-    <w:p>
-      <w:pPr>
-        <w:pStyle w:val="Heading2"/>
-      </w:pPr>
-      <w:r>
-        <w:t>15.8 D7 — Обработка одной записи (UML Sequence)</w:t>
-      </w:r>
-    </w:p>
-    <w:p>
-      <w:r>
-        <w:rPr>
-          <w:b w:val="0"/>
-          <w:i w:val="0"/>
-          <w:sz w:val="20"/>
-        </w:rPr>
-        <w:t>Детальная последовательность обработки одной JSON-строки внутри активного SAVEPOINT. Участники: BatchProcessor._process_record(), TradeService, PositionService, БД.</w:t>
-      </w:r>
-    </w:p>
-    <w:p>
-      <w:r>
-        <w:rPr>
-          <w:b w:val="0"/>
-          <w:i w:val="0"/>
-          <w:sz w:val="20"/>
-        </w:rPr>
-        <w:t>Последовательность: json.loads → IncomingTrade (Pydantic) → dedup → validate_trade → map_roles → calculate_leg2_amount → pre-check x4 (participant/counterparty × securities/cash) → INSERT trades → UPDATE positions → INSERT audit_log (SHA-256) → INSERT obligations x4 → RELEASE SAVEPOINT.</w:t>
-      </w:r>
-    </w:p>
-    <w:p>
-      <w:r>
-        <w:rPr>
-          <w:b w:val="0"/>
-          <w:i/>
-          <w:sz w:val="18"/>
-        </w:rPr>
-        <w:t>Файл: d7_seq_record.mmd</w:t>
-      </w:r>
-    </w:p>
-    <w:p>
-      <w:pPr>
-        <w:pStyle w:val="Heading2"/>
-      </w:pPr>
-      <w:r>
-        <w:t>15.9 D8 — Диаграмма компонентов (C4 Level 3)</w:t>
-      </w:r>
-    </w:p>
-    <w:p>
-      <w:r>
-        <w:rPr>
-          <w:b w:val="0"/>
-          <w:i w:val="0"/>
-          <w:sz w:val="20"/>
-        </w:rPr>
-        <w:t>Детализирует внутреннюю структуру Модуля РЕПО до уровня отдельных Python-модулей и их зависимостей.</w:t>
-      </w:r>
-    </w:p>
-    <w:tbl>
-      <w:tblPr>
-        <w:tblW w:type="auto" w:w="0"/>
-        <w:tblLook w:firstColumn="1" w:firstRow="1" w:lastColumn="0" w:lastRow="0" w:noHBand="0" w:noVBand="1" w:val="04A0"/>
-      </w:tblPr>
-      <w:tblGrid>
-        <w:gridCol w:w="3213"/>
-        <w:gridCol w:w="3213"/>
-        <w:gridCol w:w="3213"/>
-      </w:tblGrid>
-      <w:tr>
-        <w:tc>
-          <w:tcPr>
-            <w:tcW w:type="dxa" w:w="3213"/>
-            <w:shd w:val="clear" w:color="auto" w:fill="1F4E79"/>
-          </w:tcPr>
-          <w:p>
-            <w:r>
-              <w:rPr>
-                <w:b/>
-                <w:color w:val="FFFFFF"/>
-                <w:sz w:val="18"/>
-              </w:rPr>
-              <w:t>Компонент</w:t>
-            </w:r>
-          </w:p>
-        </w:tc>
-        <w:tc>
-          <w:tcPr>
-            <w:tcW w:type="dxa" w:w="3213"/>
-            <w:shd w:val="clear" w:color="auto" w:fill="1F4E79"/>
-          </w:tcPr>
-          <w:p>
-            <w:r>
-              <w:rPr>
-                <w:b/>
-                <w:color w:val="FFFFFF"/>
-                <w:sz w:val="18"/>
-              </w:rPr>
-              <w:t>Файл</w:t>
-            </w:r>
-          </w:p>
-        </w:tc>
-        <w:tc>
-          <w:tcPr>
-            <w:tcW w:type="dxa" w:w="3213"/>
-            <w:shd w:val="clear" w:color="auto" w:fill="1F4E79"/>
-          </w:tcPr>
-          <w:p>
-            <w:r>
-              <w:rPr>
-                <w:b/>
-                <w:color w:val="FFFFFF"/>
-                <w:sz w:val="18"/>
-              </w:rPr>
-              <w:t>Ответственность</w:t>
-            </w:r>
-          </w:p>
-        </w:tc>
-      </w:tr>
-      <w:tr>
-        <w:tc>
-          <w:tcPr>
-            <w:tcW w:type="dxa" w:w="3213"/>
-          </w:tcPr>
-          <w:p>
-            <w:r>
-              <w:rPr>
-                <w:sz w:val="18"/>
-              </w:rPr>
-              <w:t>BatchProcessor</w:t>
-            </w:r>
-          </w:p>
-        </w:tc>
-        <w:tc>
-          <w:tcPr>
-            <w:tcW w:type="dxa" w:w="3213"/>
-          </w:tcPr>
-          <w:p>
-            <w:r>
-              <w:rPr>
-                <w:sz w:val="18"/>
-              </w:rPr>
-              <w:t>batch/processor.py</w:t>
-            </w:r>
-          </w:p>
-        </w:tc>
-        <w:tc>
-          <w:tcPr>
-            <w:tcW w:type="dxa" w:w="3213"/>
-          </w:tcPr>
-          <w:p>
-            <w:r>
-              <w:rPr>
-                <w:sz w:val="18"/>
-              </w:rPr>
-              <w:t>Чанки, SAVEPOINT, retry, счётчики</w:t>
-            </w:r>
-          </w:p>
-        </w:tc>
-      </w:tr>
-      <w:tr>
-        <w:tc>
-          <w:tcPr>
-            <w:tcW w:type="dxa" w:w="3213"/>
-          </w:tcPr>
-          <w:p>
-            <w:r>
-              <w:rPr>
-                <w:sz w:val="18"/>
-              </w:rPr>
-              <w:t>TradeService</w:t>
-            </w:r>
-          </w:p>
-        </w:tc>
-        <w:tc>
-          <w:tcPr>
-            <w:tcW w:type="dxa" w:w="3213"/>
-          </w:tcPr>
-          <w:p>
-            <w:r>
-              <w:rPr>
-                <w:sz w:val="18"/>
-              </w:rPr>
-              <w:t>services/trade_service.py</w:t>
-            </w:r>
-          </w:p>
-        </w:tc>
-        <w:tc>
-          <w:tcPr>
-            <w:tcW w:type="dxa" w:w="3213"/>
-          </w:tcPr>
-          <w:p>
-            <w:r>
-              <w:rPr>
-                <w:sz w:val="18"/>
-              </w:rPr>
-              <w:t>map_roles, validate_trade, build_trade_create, insert_trade, cancel_trade</w:t>
-            </w:r>
-          </w:p>
-        </w:tc>
-      </w:tr>
-      <w:tr>
-        <w:tc>
-          <w:tcPr>
-            <w:tcW w:type="dxa" w:w="3213"/>
-          </w:tcPr>
-          <w:p>
-            <w:r>
-              <w:rPr>
-                <w:sz w:val="18"/>
-              </w:rPr>
-              <w:t>PositionService</w:t>
-            </w:r>
-          </w:p>
-        </w:tc>
-        <w:tc>
-          <w:tcPr>
-            <w:tcW w:type="dxa" w:w="3213"/>
-          </w:tcPr>
-          <w:p>
-            <w:r>
-              <w:rPr>
-                <w:sz w:val="18"/>
-              </w:rPr>
-              <w:t>services/position_service.py</w:t>
-            </w:r>
-          </w:p>
-        </w:tc>
-        <w:tc>
-          <w:tcPr>
-            <w:tcW w:type="dxa" w:w="3213"/>
-          </w:tcPr>
-          <w:p>
-            <w:r>
-              <w:rPr>
-                <w:sz w:val="18"/>
-              </w:rPr>
-              <w:t>apply_position_delta, apply_leg1_settlements, create_future_obligations, load_sod_balances</w:t>
-            </w:r>
-          </w:p>
-        </w:tc>
-      </w:tr>
-      <w:tr>
-        <w:tc>
-          <w:tcPr>
-            <w:tcW w:type="dxa" w:w="3213"/>
-          </w:tcPr>
-          <w:p>
-            <w:r>
-              <w:rPr>
-                <w:sz w:val="18"/>
-              </w:rPr>
-              <w:t>calc.py</w:t>
-            </w:r>
-          </w:p>
-        </w:tc>
-        <w:tc>
-          <w:tcPr>
-            <w:tcW w:type="dxa" w:w="3213"/>
-          </w:tcPr>
-          <w:p>
-            <w:r>
-              <w:rPr>
-                <w:sz w:val="18"/>
-              </w:rPr>
-              <w:t>utils/calc.py</w:t>
-            </w:r>
-          </w:p>
-        </w:tc>
-        <w:tc>
-          <w:tcPr>
-            <w:tcW w:type="dxa" w:w="3213"/>
-          </w:tcPr>
-          <w:p>
-            <w:r>
-              <w:rPr>
-                <w:sz w:val="18"/>
-              </w:rPr>
-              <w:t>calculate_leg2_amount (HALF_UP, ACT/365, ACT/360)</w:t>
-            </w:r>
-          </w:p>
-        </w:tc>
-      </w:tr>
-      <w:tr>
-        <w:tc>
-          <w:tcPr>
-            <w:tcW w:type="dxa" w:w="3213"/>
-          </w:tcPr>
-          <w:p>
-            <w:r>
-              <w:rPr>
-                <w:sz w:val="18"/>
-              </w:rPr>
-              <w:t>hashing.py</w:t>
-            </w:r>
-          </w:p>
-        </w:tc>
-        <w:tc>
-          <w:tcPr>
-            <w:tcW w:type="dxa" w:w="3213"/>
-          </w:tcPr>
-          <w:p>
-            <w:r>
-              <w:rPr>
-                <w:sz w:val="18"/>
-              </w:rPr>
-              <w:t>utils/hashing.py</w:t>
-            </w:r>
-          </w:p>
-        </w:tc>
-        <w:tc>
-          <w:tcPr>
-            <w:tcW w:type="dxa" w:w="3213"/>
-          </w:tcPr>
-          <w:p>
-            <w:r>
-              <w:rPr>
-                <w:sz w:val="18"/>
-              </w:rPr>
-              <w:t>compute_chain_hash (SHA-256 hash-chain)</w:t>
-            </w:r>
-          </w:p>
-        </w:tc>
-      </w:tr>
-      <w:tr>
-        <w:tc>
-          <w:tcPr>
-            <w:tcW w:type="dxa" w:w="3213"/>
-          </w:tcPr>
-          <w:p>
-            <w:r>
-              <w:rPr>
-                <w:sz w:val="18"/>
-              </w:rPr>
-              <w:t>ORM Models</w:t>
-            </w:r>
-          </w:p>
-        </w:tc>
-        <w:tc>
-          <w:tcPr>
-            <w:tcW w:type="dxa" w:w="3213"/>
-          </w:tcPr>
-          <w:p>
-            <w:r>
-              <w:rPr>
-                <w:sz w:val="18"/>
-              </w:rPr>
-              <w:t>db/orm.py</w:t>
-            </w:r>
-          </w:p>
-        </w:tc>
-        <w:tc>
-          <w:tcPr>
-            <w:tcW w:type="dxa" w:w="3213"/>
-          </w:tcPr>
-          <w:p>
-            <w:r>
-              <w:rPr>
-                <w:sz w:val="18"/>
-              </w:rPr>
-              <w:t>PortableUUID, PortableJSON, SQLite-триггеры</w:t>
-            </w:r>
-          </w:p>
-        </w:tc>
-      </w:tr>
-      <w:tr>
-        <w:tc>
-          <w:tcPr>
-            <w:tcW w:type="dxa" w:w="3213"/>
-          </w:tcPr>
-          <w:p>
-            <w:r>
-              <w:rPr>
-                <w:sz w:val="18"/>
-              </w:rPr>
-              <w:t>DB Base</w:t>
-            </w:r>
-          </w:p>
-        </w:tc>
-        <w:tc>
-          <w:tcPr>
-            <w:tcW w:type="dxa" w:w="3213"/>
-          </w:tcPr>
-          <w:p>
-            <w:r>
-              <w:rPr>
-                <w:sz w:val="18"/>
-              </w:rPr>
-              <w:t>db/base.py</w:t>
-            </w:r>
-          </w:p>
-        </w:tc>
-        <w:tc>
-          <w:tcPr>
-            <w:tcW w:type="dxa" w:w="3213"/>
-          </w:tcPr>
-          <w:p>
-            <w:r>
-              <w:rPr>
-                <w:sz w:val="18"/>
-              </w:rPr>
-              <w:t>get_engine, get_session, init_db, register_sqlite_events</w:t>
-            </w:r>
-          </w:p>
-        </w:tc>
-      </w:tr>
-      <w:tr>
-        <w:tc>
-          <w:tcPr>
-            <w:tcW w:type="dxa" w:w="3213"/>
-          </w:tcPr>
-          <w:p>
-            <w:r>
-              <w:rPr>
-                <w:sz w:val="18"/>
-              </w:rPr>
-              <w:t>REST API Routes</w:t>
-            </w:r>
-          </w:p>
-        </w:tc>
-        <w:tc>
-          <w:tcPr>
-            <w:tcW w:type="dxa" w:w="3213"/>
-          </w:tcPr>
-          <w:p>
-            <w:r>
-              <w:rPr>
-                <w:sz w:val="18"/>
-              </w:rPr>
-              <w:t>api/routes.py</w:t>
-            </w:r>
-          </w:p>
-        </w:tc>
-        <w:tc>
-          <w:tcPr>
-            <w:tcW w:type="dxa" w:w="3213"/>
-          </w:tcPr>
-          <w:p>
-            <w:r>
-              <w:rPr>
-                <w:sz w:val="18"/>
-              </w:rPr>
-              <w:t>FastAPI эндпоинты GET/DELETE/POST</w:t>
-            </w:r>
-          </w:p>
-        </w:tc>
-      </w:tr>
-      <w:tr>
-        <w:tc>
-          <w:tcPr>
-            <w:tcW w:type="dxa" w:w="3213"/>
-          </w:tcPr>
-          <w:p>
-            <w:r>
-              <w:rPr>
-                <w:sz w:val="18"/>
-              </w:rPr>
-              <w:t>Config</w:t>
-            </w:r>
-          </w:p>
-        </w:tc>
-        <w:tc>
-          <w:tcPr>
-            <w:tcW w:type="dxa" w:w="3213"/>
-          </w:tcPr>
-          <w:p>
-            <w:r>
-              <w:rPr>
-                <w:sz w:val="18"/>
-              </w:rPr>
-              <w:t>config.py + config.yaml + .env</w:t>
-            </w:r>
-          </w:p>
-        </w:tc>
-        <w:tc>
-          <w:tcPr>
-            <w:tcW w:type="dxa" w:w="3213"/>
-          </w:tcPr>
-          <w:p>
-            <w:r>
-              <w:rPr>
-                <w:sz w:val="18"/>
-              </w:rPr>
-              <w:t>MODE=demo/production, get_db_url, get_chunk_size</w:t>
-            </w:r>
-          </w:p>
-        </w:tc>
-      </w:tr>
-    </w:tbl>
-    <w:p>
-      <w:r>
-        <w:rPr>
-          <w:b w:val="0"/>
-          <w:i/>
-          <w:sz w:val="18"/>
-        </w:rPr>
-        <w:t>Файл: d8_c4_component.mmd</w:t>
-      </w:r>
     </w:p>
     <w:sectPr>
       <w:footerReference w:type="default" r:id="rId11"/>

</xml_diff>